<commit_message>
Strengthen SS4 functionality rubric coverage
</commit_message>
<xml_diff>
--- a/docs/SS4/Kagiso_Mmatloa_MADA372_SS4.docx
+++ b/docs/SS4/Kagiso_Mmatloa_MADA372_SS4.docx
@@ -1171,7 +1171,7 @@
     <w:p>
       <w:pPr/>
       <w:r>
-        <w:t>TextbookHub follows a simple layered Android structure suitable for the assignment requirements. Activities control each screen, XML files define the interface, ViewBinding connects Kotlin code to UI elements, adapters bind collections into RecyclerViews, and SharedPreferences stores registration/profile details locally.</w:t>
+        <w:t>TextbookHub follows a simple layered Android structure suitable for the assignment requirements. Activities control each screen, XML files define the interface, ViewBinding connects Kotlin code to UI elements, `BookCatalogViewModel` holds the textbook catalogue, adapters bind collections into RecyclerViews, and SharedPreferences stores registration/profile details locally.</w:t>
       </w:r>
     </w:p>
     <w:p>
@@ -1699,7 +1699,7 @@
                 <w:b w:val="0"/>
                 <w:sz w:val="18"/>
               </w:rPr>
-              <w:t>`HomeActivity.kt` stores sample listings in a Kotlin list and passes them into `BookAdapter`.</w:t>
+              <w:t>`BookCatalogViewModel.kt` stores sample listings in a Kotlin list and `HomeActivity.kt` passes them into `BookAdapter`.</w:t>
             </w:r>
           </w:p>
         </w:tc>
@@ -1825,7 +1825,7 @@
                 <w:b w:val="0"/>
                 <w:sz w:val="18"/>
               </w:rPr>
-              <w:t>`Book.matches()` and `HomeActivity.filterBooks()` filter by title, author, edition, course, condition, and description.</w:t>
+              <w:t>`Book.matches()`, `BookCatalogViewModel.search()`, and `HomeActivity.filterBooks()` filter by title, author, edition, course, condition, and description.</w:t>
             </w:r>
           </w:p>
         </w:tc>
@@ -1867,7 +1867,7 @@
                 <w:b w:val="0"/>
                 <w:sz w:val="18"/>
               </w:rPr>
-              <w:t>Login, registration, sell listing, and chat reply screens validate empty/invalid fields and display errors or toast messages.</w:t>
+              <w:t>Login, registration, sell listing, chat reply, and blank search actions validate invalid input and display errors or toast messages.</w:t>
             </w:r>
           </w:p>
         </w:tc>
@@ -2036,7 +2036,7 @@
                 <w:b w:val="0"/>
                 <w:sz w:val="18"/>
               </w:rPr>
-              <w:t>`ActivityHomeBinding`, `ActivityBookDetailBinding`, `ActivityMessagesBinding`, `ItemBookCardBinding`, and `ItemMessagePreviewBinding` connect Kotlin variables to XML views.</w:t>
+              <w:t>`BookCatalogViewModel` provides textbook data, while `ActivityHomeBinding`, `ActivityBookDetailBinding`, `ActivityMessagesBinding`, `ItemBookCardBinding`, and `ItemMessagePreviewBinding` connect Kotlin variables to XML views.</w:t>
             </w:r>
           </w:p>
         </w:tc>
@@ -2120,7 +2120,7 @@
                 <w:b w:val="0"/>
                 <w:sz w:val="18"/>
               </w:rPr>
-              <w:t>`BookAdapter` binds each `Book` into `item_book_card.xml`; `MessageAdapter` binds each `MessagePreview` into `item_message_preview.xml`.</w:t>
+              <w:t>`BookAdapter` uses `ListAdapter` and `DiffUtil` to bind each `Book` into `item_book_card.xml`; `MessageAdapter` binds each `MessagePreview` into `item_message_preview.xml`.</w:t>
             </w:r>
           </w:p>
         </w:tc>

</xml_diff>